<commit_message>
edit method to intrupt star
</commit_message>
<xml_diff>
--- a/reports/AI_Email_Agent_Internship_Report_Final.docx
+++ b/reports/AI_Email_Agent_Internship_Report_Final.docx
@@ -105,7 +105,7 @@
                 <w:color w:val="222222"/>
                 <w:sz w:val="22"/>
               </w:rPr>
-              <w:t>Kishan Vadsola</w:t>
+              <w:t>Krish Patel</w:t>
             </w:r>
           </w:p>
         </w:tc>
@@ -145,7 +145,7 @@
                 <w:color w:val="222222"/>
                 <w:sz w:val="22"/>
               </w:rPr>
-              <w:t>vadsolakishan1310@gmail.com</w:t>
+              <w:t>krish22patel07@gmail.com</w:t>
             </w:r>
           </w:p>
         </w:tc>

</xml_diff>